<commit_message>
Document the 1:1 chunk clip convention; fix sprite offset types in the docx
Room object image chunks follow the same convention as the static layer
chunks: 207 of the 266 retail image chunks are power-of-two padded, so their
rectangle is a 1:1 clip rather than a scale target. Note this on the
StaticSprite and RoomObjectImageChunk entities and in the Room XML docx
(new notes are marked [2026] inside the original 2012 annotations), and
correct the docx's sprite Offset X/Y fields from Int32 to Float to match
the file format.

Co-Authored-By: Claude Fable 5 <noreply@anthropic.com>
</commit_message>
<xml_diff>
--- a/Documents/Monkey Island 1 SE Room XML filetype.docx
+++ b/Documents/Monkey Island 1 SE Room XML filetype.docx
@@ -7794,6 +7794,20 @@
         <w:t>ame</w:t>
       </w:r>
     </w:p>
+    <w:p>
+      <w:pPr>
+        <w:pStyle w:val="CommentText"/>
+        <w:rPr>
+          <w:lang w:val="en-US"/>
+        </w:rPr>
+      </w:pPr>
+      <w:r>
+        <w:rPr>
+          <w:lang w:val="en-US"/>
+        </w:rPr>
+        <w:t>[2026] NB: Width/Height are a 1:1 clip of the texture, not a scale target. Chunk textures are power-of-two padded (e.g. a 1024 px wide texture placed at 896 px for the right column of a 1920 px room, a 1024x32 texture placed at the 13 line bottom strip); only the top-left Width x Height region is ever shown.</w:t>
+      </w:r>
+    </w:p>
   </w:comment>
   <w:comment w:id="30" w:author="Robin Theilade" w:date="2012-04-26T20:50:00Z" w:initials="RTH">
     <w:p>
@@ -7903,7 +7917,7 @@
         <w:rPr>
           <w:lang w:val="en-US"/>
         </w:rPr>
-        <w:t>Int32: Offset X</w:t>
+        <w:t>Float: Offset X</w:t>
       </w:r>
     </w:p>
     <w:p>
@@ -7917,7 +7931,7 @@
         <w:rPr>
           <w:lang w:val="en-US"/>
         </w:rPr>
-        <w:t>Int32: Offset Y</w:t>
+        <w:t>Float: Offset Y</w:t>
       </w:r>
     </w:p>
     <w:p>
@@ -8156,6 +8170,20 @@
           <w:lang w:val="en-US"/>
         </w:rPr>
         <w:t>Float: ???</w:t>
+      </w:r>
+    </w:p>
+    <w:p>
+      <w:pPr>
+        <w:pStyle w:val="CommentText"/>
+        <w:rPr>
+          <w:lang w:val="en-US"/>
+        </w:rPr>
+      </w:pPr>
+      <w:r>
+        <w:rPr>
+          <w:lang w:val="en-US"/>
+        </w:rPr>
+        <w:t>[2026] This is a room object ("Chandelier", "Water", ...): offset to a sprite record (offset to texture file name, then X/Y/Width/Height of an atlas rectangle), offset to an image record (a chunked room-sized overlay: source width/height, chunk count, offset to chunks of X/Y/Width/Height plus a texture file name offset), then X/Y offset floats. Image chunk rectangles are, like static sprites, 1:1 clips of power-of-two padded textures (207 of the 266 retail image chunks are padded).</w:t>
       </w:r>
     </w:p>
   </w:comment>

</xml_diff>